<commit_message>
Amos 배지 정밀화 (OT 전수조사): 4곳 (EN+KO) — 7장 '8-9'×4→'8'×3+'9', 9:7 '13'→'13-14'. 독스 9/9 export-back OK.
</commit_message>
<xml_diff>
--- a/gdocs_build/Amos.docx
+++ b/gdocs_build/Amos.docx
@@ -5820,7 +5820,7 @@
                 <w:b/>
                 <w:sz w:val="16"/>
               </w:rPr>
-              <w:t>8-9</w:t>
+              <w:t>8</w:t>
             </w:r>
           </w:p>
           <w:p>
@@ -5843,7 +5843,7 @@
                 <w:b/>
                 <w:sz w:val="16"/>
               </w:rPr>
-              <w:t>8-9</w:t>
+              <w:t>8</w:t>
             </w:r>
           </w:p>
           <w:p>
@@ -5866,7 +5866,7 @@
                 <w:b/>
                 <w:sz w:val="16"/>
               </w:rPr>
-              <w:t>8-9</w:t>
+              <w:t>8</w:t>
             </w:r>
           </w:p>
           <w:p>
@@ -5891,7 +5891,7 @@
                 <w:b/>
                 <w:sz w:val="16"/>
               </w:rPr>
-              <w:t>8-9</w:t>
+              <w:t>8</w:t>
             </w:r>
           </w:p>
           <w:p>
@@ -5914,7 +5914,7 @@
                 <w:b/>
                 <w:sz w:val="16"/>
               </w:rPr>
-              <w:t>8-9</w:t>
+              <w:t>8</w:t>
             </w:r>
           </w:p>
           <w:p>
@@ -5937,7 +5937,7 @@
                 <w:b/>
                 <w:sz w:val="16"/>
               </w:rPr>
-              <w:t>8-9</w:t>
+              <w:t>8</w:t>
             </w:r>
           </w:p>
           <w:p>
@@ -5962,7 +5962,7 @@
                 <w:b/>
                 <w:sz w:val="16"/>
               </w:rPr>
-              <w:t>8-9</w:t>
+              <w:t>8</w:t>
             </w:r>
           </w:p>
           <w:p>
@@ -5985,7 +5985,7 @@
                 <w:b/>
                 <w:sz w:val="16"/>
               </w:rPr>
-              <w:t>8-9</w:t>
+              <w:t>8</w:t>
             </w:r>
           </w:p>
           <w:p>
@@ -6008,7 +6008,7 @@
                 <w:b/>
                 <w:sz w:val="16"/>
               </w:rPr>
-              <w:t>8-9</w:t>
+              <w:t>8</w:t>
             </w:r>
           </w:p>
           <w:p>
@@ -6033,7 +6033,7 @@
                 <w:b/>
                 <w:sz w:val="16"/>
               </w:rPr>
-              <w:t>8-9</w:t>
+              <w:t>9</w:t>
             </w:r>
           </w:p>
           <w:p>
@@ -6056,7 +6056,7 @@
                 <w:b/>
                 <w:sz w:val="16"/>
               </w:rPr>
-              <w:t>8-9</w:t>
+              <w:t>9</w:t>
             </w:r>
           </w:p>
           <w:p>
@@ -6079,7 +6079,7 @@
                 <w:b/>
                 <w:sz w:val="16"/>
               </w:rPr>
-              <w:t>8-9</w:t>
+              <w:t>9</w:t>
             </w:r>
           </w:p>
           <w:p>
@@ -7942,7 +7942,7 @@
                 <w:b/>
                 <w:sz w:val="16"/>
               </w:rPr>
-              <w:t>13-15</w:t>
+              <w:t>13-14</w:t>
             </w:r>
           </w:p>
           <w:p>
@@ -7965,7 +7965,7 @@
                 <w:b/>
                 <w:sz w:val="16"/>
               </w:rPr>
-              <w:t>13-15</w:t>
+              <w:t>13-14</w:t>
             </w:r>
           </w:p>
           <w:p>
@@ -7988,7 +7988,7 @@
                 <w:b/>
                 <w:sz w:val="16"/>
               </w:rPr>
-              <w:t>13-15</w:t>
+              <w:t>13-14</w:t>
             </w:r>
           </w:p>
           <w:p>

</xml_diff>